<commit_message>
Apply the Vong 4 A3/B manuscript fixes without changing locked ECE or FAR cells.
Co-authored-by: Cursor <cursoragent@cursor.com>
</commit_message>
<xml_diff>
--- a/sparse-calibration-kt/IJIET_FINAL_REVISION/manuscript/Reproducible Sparse-Concept and Calibration Diagnostics for Knowledge Tracing.docx
+++ b/sparse-calibration-kt/IJIET_FINAL_REVISION/manuscript/Reproducible Sparse-Concept and Calibration Diagnostics for Knowledge Tracing.docx
@@ -1363,7 +1363,7 @@
         <w:spacing w:line="252" w:lineRule="exact"/>
       </w:pPr>
       <w:r>
-        <w:t>Deep models are trained in five runs at seeds 42, 2024, 2025, 2026, and 2027 (fold_0 through fold_4). Seeds 2025 and 2026 share one student partition (fold_2 = fold_3) on all three datasets. These are five training runs spanning four unique learner partitions; two runs share one learner partition, not five independent folds. Tables that report mean±sd therefore summarize four unique partitions: the two initializations on the duplicated split are averaged first. For the duplicated evaluation partition, the two T-KT initializations are first averaged to form one partition-level estimate; the reported four-partition mean then assigns equal weight to each unique learner partition, using the same aggregation as the DKT and IRT rows. On Junyi, that duplicated partition is official fold 0 (seeds 42 and 2024). Tables A2–A3 still list all five training runs across four unique learner partitions.</w:t>
+        <w:t>Deep models are trained in five runs at seeds 42, 2024, 2025, 2026, and 2027 (fold_0 through fold_4). Seeds 2025 and 2026 share one student partition (fold_2 = fold_3) on ASSISTments 2012 and XES3G5M. These are five training runs spanning four unique learner partitions; two runs share one learner partition, not five independent folds. Tables that report mean±sd therefore summarize four unique partitions: the two initializations on the duplicated split are averaged first. For ASSISTments and XES3G5M, that duplicated evaluation partition is fold_2 = fold_3 (seeds 2025 and 2026). On Junyi, T-KT seeds 42 and 2024 are two initializations scored on official fold 0 and averaged first; seeds 2025, 2026, and 2027 cover official folds 1, 2, and 4, so Junyi T-KT still uses four unique partitions with the same equal-weight aggregation as the DKT and IRT rows. Table A2 reports the seed-42 / fold-0 gate; Table A3 summarizes the gate over the four unique learner partitions, and its caption gives the corresponding five-run means.</w:t>
       </w:r>
     </w:p>
     <w:p>
@@ -1384,14 +1384,10 @@
         <w:spacing w:line="252" w:lineRule="exact"/>
       </w:pPr>
       <w:r>
-        <w:t xml:space="preserve">Main tables use local IRT, DKT, and a local Transformer reference model (T-KT). The original training-container commit is NOT RECOVERED and is not imputed. Source bytes used in the A5 audit are recorded at a commit hash withheld for blind review; the hash is recorded in the accompanying artifact. The local Transformer reference is a two-layer Transformer encoder over DKT-style KC-response tokens. T-KT is used as a local reference model to stress-test the diagnostic protocol; it is not the published SimpleKT architecture and is not intended to represent Transformer-based KT models generally. Official SimpleKT </w:t>
-      </w:r>
-      <w:r>
-        <w:t>[4]</w:t>
-      </w:r>
-      <w:r>
-        <w:t xml:space="preserve"> is scored on ASSISTments AUC/ECE only, as an external ASSISTments check of whether the observed dense-to-sparse ECE direction is unique to the local T-KT reference. Table 2 reports recovered training settings; missing fields are marked NOT RECOVERED and are not imputed.</w:t>
-      </w:r>
+        <w:t>Main tables use local IRT, DKT, and a local Transformer reference model (T-KT). The original training-container commit is NOT RECOVERED and is not imputed. Source bytes used in the A5 audit are recorded at a commit hash listed in the accompanying artifact. The local Transformer reference is a two-layer Transformer encoder over DKT-style KC-response tokens. T-KT is used as a local reference model to stress-test the diagnostic protocol; it is not the published SimpleKT architecture and is not intended to represent Transformer-based KT models generally. Official SimpleKT [4] is scored on ASSISTments AUC/ECE only, as an external ASSISTments check of whether the observed dense-to-sparse ECE direction is unique to the local T-KT reference. Table 2 reports recovered training settings; missing fields are marked NOT RECOVERED and are not imputed.</w:t>
+      </w:r>
+      <w:r/>
+      <w:r/>
     </w:p>
     <w:p>
       <w:pPr>
@@ -11635,7 +11631,7 @@
         <w:spacing w:line="252" w:lineRule="exact"/>
       </w:pPr>
       <w:r>
-        <w:t>A locked gate at τ=0.7 is a simulated next-response decision-error probe, not RQ3. On ASSISTments 2012, T-KT FAR is 0.196 on dense KCs and 0.268 on sparse KCs (ΔFAR = +0.072; seed 42; KC-clustered percentile bootstrap 95% CI [0.006, 0.138], B = 2000), and ΔFAR is positive in 4/4 unique learner partitions (partition-level mean 0.056). For DKT the same probe is positive in only 3 of 4 unique partitions (Table A3; five-run count 3/5 is a different unit), so the stratum difference in gate error is not uniform across backbones; the lower confidence bound for T-KT is close to zero, and we therefore report the direction of ΔFAR, not its robustness. On XES3G5M the same T-KT probe is negative (five-run mean ΔFAR −0.017, positive on 0/5 runs; sparse N mean 1,957; frozen a2b artifact). ASSISTments FAR denominators and partition-level summaries are reported in Tables A2–A3; the occupancy-policy counterfactual remains in the accompanying artifact; the τ-grid is Table A6.</w:t>
+        <w:t>A locked gate at τ=0.7 is a simulated next-response decision-error probe, not RQ3. On ASSISTments 2012, T-KT FAR is 0.196 on dense KCs and 0.268 on sparse KCs (ΔFAR = +0.072; seed 42; KC-clustered percentile bootstrap 95% CI [0.006, 0.138], B = 2000), and ΔFAR is positive in 4/4 unique learner partitions (partition-level mean 0.056). For DKT the same probe is positive in only 3 of 4 unique partitions (Table A3; five-run count 3/5 is a different unit), so the stratum difference in gate error is not uniform across backbones; the lower confidence bound for T-KT is close to zero, and we therefore report the direction of ΔFAR, not its robustness. On XES3G5M the same T-KT probe is negative on 0/4 unique partitions (partition-level mean ΔFAR = −0.019; five-run mean −0.017; sparse N mean 1,957; accompanying artifact). ASSISTments FAR denominators and partition-level summaries are reported in Tables A2–A3; the occupancy-policy counterfactual remains in the accompanying artifact; the τ-grid is Table A6.</w:t>
       </w:r>
     </w:p>
     <w:p>
@@ -11749,7 +11745,7 @@
         <w:spacing w:line="252" w:lineRule="exact"/>
       </w:pPr>
       <w:r>
-        <w:t>Two empirical regularities, not laws, structure the results. First, training frequency is not a universal predictor of AUC failure: on XES3G5M, sparse-stratum AUC is higher than dense-stratum AUC for DKT and T-KT (Reliable occupancy), and Junyi’s learner-based sparse bucket is empty (exercise-level operational identifier, ucid) rather than a ranking collapse. Second, the observed sparse-stratum calibration pattern is dataset- and model-dependent. ASSISTments 2012 T-KT ECE is associated with a dense-to-sparse rise under Limited sparse support (Table 5, N=415); XES3G5M T-KT ECE does not show the same adverse dense-to-sparse gradient as ASSISTments (0.1176 / 0.1129 / 0.1254, interpreted descriptively) despite Reliable sparse occupancy, while XES DKT ECE/Brier/REL worsen. Calibration is not guaranteed to worsen as frequency falls. As a secondary operational probe, a locked next-response gate can differ by frequency stratum: ASSISTments T-KT ΔFAR is positive in 4/4 unique partitions (direction only; seed-42 95% CI [0.006, 0.138]), DKT is positive in only 3/4 unique partitions (Table A3), and the XES3G5M T-KT probe is negative (five-run mean ΔFAR −0.017; frozen a2b artifact; ASSISTments denominators in Tables A2–A3).</w:t>
+        <w:t>Two empirical regularities, not laws, structure the results. First, training frequency is not a universal predictor of AUC failure: on XES3G5M, sparse-stratum AUC is higher than dense-stratum AUC for DKT and T-KT (Reliable occupancy), and Junyi’s learner-based sparse bucket is empty (exercise-level operational identifier, ucid) rather than a ranking collapse. Second, the observed sparse-stratum calibration pattern is dataset- and model-dependent. ASSISTments 2012 T-KT ECE is associated with a dense-to-sparse rise under Limited sparse support (Table 5, N=415); XES3G5M T-KT ECE does not show the same adverse dense-to-sparse gradient as ASSISTments (0.1176 / 0.1129 / 0.1254, interpreted descriptively) despite Reliable sparse occupancy, while XES DKT ECE/Brier/REL worsen. Calibration is not guaranteed to worsen as frequency falls. As a secondary operational probe, a locked next-response gate can differ by frequency stratum: ASSISTments T-KT ΔFAR is positive in 4/4 unique partitions (direction only; seed-42 95% CI [0.006, 0.138]), DKT is positive in only 3/4 unique partitions (Table A3), and the XES3G5M T-KT probe is negative on 0/4 unique partitions (partition-level mean ΔFAR = −0.019; five-run mean −0.017; accompanying artifact; ASSISTments denominators in Tables A2–A3).</w:t>
       </w:r>
     </w:p>
     <w:p>
@@ -11824,26 +11820,14 @@
         <w:spacing w:line="252" w:lineRule="exact"/>
       </w:pPr>
       <w:r>
-        <w:t xml:space="preserve">Next-response correctness is not latent mastery: y=0 is an incorrect next attempt, not a latent-skill diagnosis. The threshold gate is a simulated probe, not a classroom policy. There is no classroom RCT. We do not train graph, contrastive, or self-supervised KT models. BKT is not a scored baseline; IRT is the classical reference (pyBKT 1.4.1 degenerated on ASSISTments seed 42; reported in the accompanying artifact). T-KT is a local Transformer reference used to stress-test the protocol; it is not the published SimpleKT architecture </w:t>
-      </w:r>
-      <w:r>
-        <w:t>[4]</w:t>
-      </w:r>
-      <w:r>
-        <w:t xml:space="preserve"> and is not intended to represent Transformer-based KT models generally. Official SimpleKT is an external ASSISTments check of whether the observed dense-to-sparse ECE direction is unique to the local T-KT reference. Temporal evaluation uses a single corrected cutoff (seed 42). Seeds 2025 and 2026 share a split. R/L/I are descriptive support flags. ECE depends on binning. We do not report size-matched or cluster-bootstrap confidence intervals for primary stratum ΔECE; those calibration contrasts are interpreted descriptively, and because Table A1 also shows ΔECE shrinking as sparse N grows, we interpret the sign of the dense-to-sparse ECE contrast, not its magnitude </w:t>
-      </w:r>
-      <w:r>
-        <w:t>[26]</w:t>
-      </w:r>
-      <w:r>
-        <w:t xml:space="preserve">, </w:t>
-      </w:r>
-      <w:r>
-        <w:t>[27]</w:t>
-      </w:r>
-      <w:r>
-        <w:t>. Three datasets cannot establish a universal diagnostic law. We evaluate Junyi at the ucid level only; other concept granularities in that dump are not assessed and are left to future work. The reported diagnostics are reproduced from the frozen accompanying artifact (code_for_review_anonymous.zip) submitted with this manuscript. Locked ASSISTments T-KT ECE cells and the accompanying artifact stratum-AUC and baseline-inventory tables rebuild from frozen summaries (scripts/rebuild_locked_tables.sh); that command does not retrain models and does not recreate historical training-container commits (Table 2: NOT RECOVERED).</w:t>
-      </w:r>
+        <w:t>Next-response correctness is not latent mastery: y=0 is an incorrect next attempt, not a latent-skill diagnosis. The threshold gate is a simulated probe, not a classroom policy. There is no classroom RCT. We do not train graph, contrastive, or self-supervised KT models. BKT is not a scored baseline; IRT is the classical reference (pyBKT 1.4.1 degenerated on ASSISTments seed 42; reported in the accompanying artifact). T-KT is a local Transformer reference used to stress-test the protocol; it is not the published SimpleKT architecture [4] and is not intended to represent Transformer-based KT models generally. Official SimpleKT is an external ASSISTments check of whether the observed dense-to-sparse ECE direction is unique to the local T-KT reference. Temporal evaluation uses a single corrected cutoff (seed 42). Seeds 2025 and 2026 share a split. R/L/I are descriptive support flags. ECE depends on binning. We do not report size-matched or cluster-bootstrap confidence intervals for primary stratum ΔECE; those calibration contrasts are interpreted descriptively, and because Table A1 also shows ΔECE shrinking as sparse N grows, we interpret the sign of the dense-to-sparse ECE contrast, not its magnitude [26], [27]. Three datasets cannot establish a universal diagnostic law. We evaluate Junyi at the ucid level only; other concept granularities in that dump are not assessed and are left to future work. The reported diagnostics are reproduced from the frozen accompanying artifact submitted with this manuscript. Locked ASSISTments T-KT ECE cells and the accompanying artifact stratum-AUC and baseline-inventory tables rebuild from frozen summaries (scripts/rebuild_locked_tables.sh); that command does not retrain models and does not recreate historical training-container commits (Table 2: NOT RECOVERED).</w:t>
+      </w:r>
+      <w:r/>
+      <w:r/>
+      <w:r/>
+      <w:r/>
+      <w:r/>
+      <w:r/>
     </w:p>
     <w:p>
       <w:pPr>
@@ -11898,7 +11882,7 @@
         <w:spacing w:line="252" w:lineRule="exact"/>
       </w:pPr>
       <w:r>
-        <w:t>This appendix reprints the diagnostic tables needed to follow the main argument in one IJIET file. Table A1 is the alternative train-only frequency-cut check. Tables A2–A3 are the locked τ=0.7 FAR probe (not RQ3). Tables A4a–A4b are the full Brier/UNC/REL/RES grid. Table A5 is the full L1–L7 audit. Table A6 is the locked T-KT τ-grid on ASSISTments fold 0. The occupancy counterfactual, full controlled-sparsification grid, stratum AUC/ACC, and baseline inventory remain in the accompanying artifact (code_for_review_anonymous.zip).</w:t>
+        <w:t>This appendix reprints the diagnostic tables needed to follow the main argument in one IJIET file. Table A1 is the alternative train-only frequency-cut check. Tables A2–A3 are the locked τ=0.7 FAR probe (not RQ3). Tables A4a–A4b are the full Brier/UNC/REL/RES grid. Table A5 is the full L1–L7 audit. Table A6 is the locked T-KT τ-grid on ASSISTments fold 0. The occupancy counterfactual, full controlled-sparsification grid, stratum AUC/ACC, and baseline inventory remain in the accompanying artifact.</w:t>
       </w:r>
     </w:p>
     <w:p>
@@ -13551,7 +13535,7 @@
         <w:spacing w:before="80" w:after="40"/>
       </w:pPr>
       <w:r>
-        <w:t>Table A3. Gate robustness at τ=0.7 on ASSISTments 2012 (primary unit: four unique learner partitions). T-KT Mean ΔFAR is the partition-level mean 0.056 (SD column is the partition range 0.015–0.087) after averaging seeds 2025 and 2026 first. The five T-KT training runs have mean 0.047 (sd 0.033) because those two seeds share one split. DKT Mean ΔFAR is the partition-level mean 0.040 (range −0.011–0.096) after the same averaging; ΔFAR&gt;0 on 3/4 unique partitions. The five DKT runs remain 3/5 positive (mean 0.033, sd 0.048) and are not the same counting unit as the T-KT 4/4 cell. Mean N, N_adv, and N_inc are sparse-stratum gate denominators: events with a valid predicted probability admitted to the locked τ=0.7 probe (four-partition mean N=413). Table 5 N=415 counts all sparse test events on the same partitions. Table A2 N=444 is seed 42 / fold 0 only.</w:t>
+        <w:t>Table A3. Gate robustness at τ=0.7 on ASSISTments 2012 (primary unit: four unique learner partitions). T-KT Mean ΔFAR is the partition-level mean 0.056 after averaging seeds 2025 and 2026 first. The SD column is the sample standard deviation of the four partition-level ΔFAR values. The five T-KT training runs have mean 0.047 (sd 0.033) because those two seeds share one split. DKT Mean ΔFAR is the partition-level mean 0.040 (range −0.011–0.096) after the same averaging; ΔFAR&gt;0 on 3/4 unique partitions. The five DKT runs remain 3/5 positive (mean 0.033, sd 0.048) and are not the same counting unit as the T-KT 4/4 cell. Mean N, N_adv, and N_inc are sparse-stratum gate denominators: events with a valid predicted probability admitted to the locked τ=0.7 probe (four-partition mean N=413). Table 5 N=415 counts all sparse test events on the same partitions. Table A2 N=444 is seed 42 / fold 0 only.</w:t>
       </w:r>
     </w:p>
     <w:tbl>
@@ -13777,10 +13761,7 @@
           </w:tcPr>
           <w:p>
             <w:r>
-              <w:rPr>
-                <w:sz w:val="16"/>
-              </w:rPr>
-              <w:t>—</w:t>
+              <w:t>0.031</w:t>
             </w:r>
           </w:p>
         </w:tc>
@@ -13894,10 +13875,7 @@
           </w:tcPr>
           <w:p>
             <w:r>
-              <w:rPr>
-                <w:sz w:val="16"/>
-              </w:rPr>
-              <w:t>—</w:t>
+              <w:t>0.052</w:t>
             </w:r>
           </w:p>
         </w:tc>
@@ -14086,8 +14064,9 @@
         </w:tc>
         <w:tc>
           <w:tcPr>
-            <w:tcW w:w="359" w:type="pct"/>
-            <w:vAlign w:val="center"/>
+            <w:tcW w:w="1134" w:type="dxa"/>
+            <w:vAlign w:val="center"/>
+            <w:noWrap/>
           </w:tcPr>
           <w:p>
             <w:pPr>
@@ -14281,8 +14260,9 @@
         </w:tc>
         <w:tc>
           <w:tcPr>
-            <w:tcW w:w="359" w:type="pct"/>
-            <w:vAlign w:val="center"/>
+            <w:tcW w:w="1134" w:type="dxa"/>
+            <w:vAlign w:val="center"/>
+            <w:noWrap/>
           </w:tcPr>
           <w:p>
             <w:pPr>
@@ -14427,8 +14407,9 @@
         </w:tc>
         <w:tc>
           <w:tcPr>
-            <w:tcW w:w="359" w:type="pct"/>
-            <w:vAlign w:val="center"/>
+            <w:tcW w:w="1134" w:type="dxa"/>
+            <w:vAlign w:val="center"/>
+            <w:noWrap/>
           </w:tcPr>
           <w:p>
             <w:pPr>
@@ -14573,8 +14554,9 @@
         </w:tc>
         <w:tc>
           <w:tcPr>
-            <w:tcW w:w="359" w:type="pct"/>
-            <w:vAlign w:val="center"/>
+            <w:tcW w:w="1134" w:type="dxa"/>
+            <w:vAlign w:val="center"/>
+            <w:noWrap/>
           </w:tcPr>
           <w:p>
             <w:pPr>
@@ -14719,8 +14701,9 @@
         </w:tc>
         <w:tc>
           <w:tcPr>
-            <w:tcW w:w="359" w:type="pct"/>
-            <w:vAlign w:val="center"/>
+            <w:tcW w:w="1134" w:type="dxa"/>
+            <w:vAlign w:val="center"/>
+            <w:noWrap/>
           </w:tcPr>
           <w:p>
             <w:pPr>
@@ -14865,8 +14848,9 @@
         </w:tc>
         <w:tc>
           <w:tcPr>
-            <w:tcW w:w="359" w:type="pct"/>
-            <w:vAlign w:val="center"/>
+            <w:tcW w:w="1134" w:type="dxa"/>
+            <w:vAlign w:val="center"/>
+            <w:noWrap/>
           </w:tcPr>
           <w:p>
             <w:pPr>
@@ -15011,8 +14995,9 @@
         </w:tc>
         <w:tc>
           <w:tcPr>
-            <w:tcW w:w="359" w:type="pct"/>
-            <w:vAlign w:val="center"/>
+            <w:tcW w:w="1134" w:type="dxa"/>
+            <w:vAlign w:val="center"/>
+            <w:noWrap/>
           </w:tcPr>
           <w:p>
             <w:pPr>
@@ -15157,8 +15142,9 @@
         </w:tc>
         <w:tc>
           <w:tcPr>
-            <w:tcW w:w="359" w:type="pct"/>
-            <w:vAlign w:val="center"/>
+            <w:tcW w:w="1134" w:type="dxa"/>
+            <w:vAlign w:val="center"/>
+            <w:noWrap/>
           </w:tcPr>
           <w:p>
             <w:pPr>
@@ -15303,8 +15289,9 @@
         </w:tc>
         <w:tc>
           <w:tcPr>
-            <w:tcW w:w="359" w:type="pct"/>
-            <w:vAlign w:val="center"/>
+            <w:tcW w:w="1134" w:type="dxa"/>
+            <w:vAlign w:val="center"/>
+            <w:noWrap/>
           </w:tcPr>
           <w:p>
             <w:pPr>
@@ -15449,8 +15436,9 @@
         </w:tc>
         <w:tc>
           <w:tcPr>
-            <w:tcW w:w="359" w:type="pct"/>
-            <w:vAlign w:val="center"/>
+            <w:tcW w:w="1134" w:type="dxa"/>
+            <w:vAlign w:val="center"/>
+            <w:noWrap/>
           </w:tcPr>
           <w:p>
             <w:pPr>
@@ -15595,8 +15583,9 @@
         </w:tc>
         <w:tc>
           <w:tcPr>
-            <w:tcW w:w="359" w:type="pct"/>
-            <w:vAlign w:val="center"/>
+            <w:tcW w:w="1134" w:type="dxa"/>
+            <w:vAlign w:val="center"/>
+            <w:noWrap/>
           </w:tcPr>
           <w:p>
             <w:pPr>
@@ -15741,8 +15730,9 @@
         </w:tc>
         <w:tc>
           <w:tcPr>
-            <w:tcW w:w="359" w:type="pct"/>
-            <w:vAlign w:val="center"/>
+            <w:tcW w:w="1134" w:type="dxa"/>
+            <w:vAlign w:val="center"/>
+            <w:noWrap/>
           </w:tcPr>
           <w:p>
             <w:pPr>
@@ -15887,8 +15877,9 @@
         </w:tc>
         <w:tc>
           <w:tcPr>
-            <w:tcW w:w="359" w:type="pct"/>
-            <w:vAlign w:val="center"/>
+            <w:tcW w:w="1134" w:type="dxa"/>
+            <w:vAlign w:val="center"/>
+            <w:noWrap/>
           </w:tcPr>
           <w:p>
             <w:pPr>
@@ -16033,8 +16024,9 @@
         </w:tc>
         <w:tc>
           <w:tcPr>
-            <w:tcW w:w="359" w:type="pct"/>
-            <w:vAlign w:val="center"/>
+            <w:tcW w:w="1134" w:type="dxa"/>
+            <w:vAlign w:val="center"/>
+            <w:noWrap/>
           </w:tcPr>
           <w:p>
             <w:pPr>
@@ -16179,8 +16171,9 @@
         </w:tc>
         <w:tc>
           <w:tcPr>
-            <w:tcW w:w="359" w:type="pct"/>
-            <w:vAlign w:val="center"/>
+            <w:tcW w:w="1134" w:type="dxa"/>
+            <w:vAlign w:val="center"/>
+            <w:noWrap/>
           </w:tcPr>
           <w:p>
             <w:pPr>
@@ -16325,8 +16318,9 @@
         </w:tc>
         <w:tc>
           <w:tcPr>
-            <w:tcW w:w="359" w:type="pct"/>
-            <w:vAlign w:val="center"/>
+            <w:tcW w:w="1134" w:type="dxa"/>
+            <w:vAlign w:val="center"/>
+            <w:noWrap/>
           </w:tcPr>
           <w:p>
             <w:pPr>
@@ -16536,8 +16530,9 @@
         </w:tc>
         <w:tc>
           <w:tcPr>
-            <w:tcW w:w="359" w:type="pct"/>
-            <w:vAlign w:val="center"/>
+            <w:tcW w:w="1134" w:type="dxa"/>
+            <w:vAlign w:val="center"/>
+            <w:noWrap/>
           </w:tcPr>
           <w:p>
             <w:pPr>
@@ -16731,8 +16726,9 @@
         </w:tc>
         <w:tc>
           <w:tcPr>
-            <w:tcW w:w="359" w:type="pct"/>
-            <w:vAlign w:val="center"/>
+            <w:tcW w:w="1134" w:type="dxa"/>
+            <w:vAlign w:val="center"/>
+            <w:noWrap/>
           </w:tcPr>
           <w:p>
             <w:pPr>
@@ -16877,8 +16873,9 @@
         </w:tc>
         <w:tc>
           <w:tcPr>
-            <w:tcW w:w="359" w:type="pct"/>
-            <w:vAlign w:val="center"/>
+            <w:tcW w:w="1134" w:type="dxa"/>
+            <w:vAlign w:val="center"/>
+            <w:noWrap/>
           </w:tcPr>
           <w:p>
             <w:pPr>
@@ -17023,8 +17020,9 @@
         </w:tc>
         <w:tc>
           <w:tcPr>
-            <w:tcW w:w="359" w:type="pct"/>
-            <w:vAlign w:val="center"/>
+            <w:tcW w:w="1134" w:type="dxa"/>
+            <w:vAlign w:val="center"/>
+            <w:noWrap/>
           </w:tcPr>
           <w:p>
             <w:pPr>
@@ -17169,8 +17167,9 @@
         </w:tc>
         <w:tc>
           <w:tcPr>
-            <w:tcW w:w="359" w:type="pct"/>
-            <w:vAlign w:val="center"/>
+            <w:tcW w:w="1134" w:type="dxa"/>
+            <w:vAlign w:val="center"/>
+            <w:noWrap/>
           </w:tcPr>
           <w:p>
             <w:pPr>
@@ -17315,8 +17314,9 @@
         </w:tc>
         <w:tc>
           <w:tcPr>
-            <w:tcW w:w="359" w:type="pct"/>
-            <w:vAlign w:val="center"/>
+            <w:tcW w:w="1134" w:type="dxa"/>
+            <w:vAlign w:val="center"/>
+            <w:noWrap/>
           </w:tcPr>
           <w:p>
             <w:pPr>
@@ -17461,8 +17461,9 @@
         </w:tc>
         <w:tc>
           <w:tcPr>
-            <w:tcW w:w="359" w:type="pct"/>
-            <w:vAlign w:val="center"/>
+            <w:tcW w:w="1134" w:type="dxa"/>
+            <w:vAlign w:val="center"/>
+            <w:noWrap/>
           </w:tcPr>
           <w:p>
             <w:pPr>
@@ -17607,8 +17608,9 @@
         </w:tc>
         <w:tc>
           <w:tcPr>
-            <w:tcW w:w="359" w:type="pct"/>
-            <w:vAlign w:val="center"/>
+            <w:tcW w:w="1134" w:type="dxa"/>
+            <w:vAlign w:val="center"/>
+            <w:noWrap/>
           </w:tcPr>
           <w:p>
             <w:pPr>
@@ -17753,8 +17755,9 @@
         </w:tc>
         <w:tc>
           <w:tcPr>
-            <w:tcW w:w="359" w:type="pct"/>
-            <w:vAlign w:val="center"/>
+            <w:tcW w:w="1134" w:type="dxa"/>
+            <w:vAlign w:val="center"/>
+            <w:noWrap/>
           </w:tcPr>
           <w:p>
             <w:pPr>
@@ -17899,8 +17902,9 @@
         </w:tc>
         <w:tc>
           <w:tcPr>
-            <w:tcW w:w="359" w:type="pct"/>
-            <w:vAlign w:val="center"/>
+            <w:tcW w:w="1134" w:type="dxa"/>
+            <w:vAlign w:val="center"/>
+            <w:noWrap/>
           </w:tcPr>
           <w:p>
             <w:pPr>
@@ -22155,7 +22159,7 @@
         <w:rPr>
           <w:noProof/>
         </w:rPr>
-        <w:t>An accompanying artifact accompanies this submission. It contains configuration files, preprocessing and audit scripts, frozen diagnostic summaries, audit records, and a command that rebuilds the reported diagnostic tables from those summaries. It does not include the raw public datasets (obtain those from the original providers), historical training containers, or a guaranteed full retrain. The artifact supports re-derivation of the reported tables, not recreation of historical training-container commits. Source benchmark datasets are publicly released by their original providers. Upon acceptance, the artifact contents needed to rebuild the reported tables—including the τ-grid and the controlled-sparsification grid—will be included in the public repository at https://github.com/trinhnkt/Sparse-Concept-and-Calibration.</w:t>
+        <w:t>The artifact accompanying this submission contains configuration files, preprocessing and audit scripts, frozen diagnostic summaries, audit records, and a command that rebuilds the reported diagnostic tables from those summaries. It does not include the raw public datasets (obtain those from the original providers), historical training containers, or a guaranteed full retrain. The artifact supports re-derivation of the reported tables, not recreation of historical training-container commits. Source benchmark datasets are publicly released by their original providers. Upon acceptance, the artifact contents needed to rebuild the reported tables—including the τ-grid and the controlled-sparsification grid—will be included in the public repository at https://github.com/trinhnkt/Sparse-Concept-and-Calibration.</w:t>
       </w:r>
     </w:p>
     <w:p>
@@ -22550,7 +22554,7 @@
         <w:pStyle w:val="References"/>
       </w:pPr>
       <w:r>
-        <w:t>X. Yan, C. Tang, and A. Shimada, “Recovering Stranded Discrimination in Knowledge Tracing: Per-Item Bias Correction via Empirical-Bayes Shrinkage,” in press. doi: 10.48550/arXiv.2606.14123</w:t>
+        <w:t>X. Yan, C. Tang, and A. Shimada, “Recovering Stranded Discrimination in Knowledge Tracing: Per-Item Bias Correction via Empirical-Bayes Shrinkage,” in Proc. Eur. Conf. Mach. Learn. Knowl. Discov. Databases (ECML PKDD), 2026, to appear. arXiv:2606.14123</w:t>
       </w:r>
     </w:p>
     <w:p>

</xml_diff>